<commit_message>
Réponses à l'exercice 2
</commit_message>
<xml_diff>
--- a/reponses/exo-terraform.docx
+++ b/reponses/exo-terraform.docx
@@ -93,8 +93,13 @@
           </w:tcPr>
           <w:p>
             <w:r>
-              <w:t>/health</w:t>
-            </w:r>
+              <w:t>/</w:t>
+            </w:r>
+            <w:proofErr w:type="spellStart"/>
+            <w:r>
+              <w:t>health</w:t>
+            </w:r>
+            <w:proofErr w:type="spellEnd"/>
           </w:p>
         </w:tc>
         <w:tc>
@@ -125,8 +130,13 @@
           </w:tcPr>
           <w:p>
             <w:r>
-              <w:t>/orders</w:t>
-            </w:r>
+              <w:t>/</w:t>
+            </w:r>
+            <w:proofErr w:type="spellStart"/>
+            <w:r>
+              <w:t>orders</w:t>
+            </w:r>
+            <w:proofErr w:type="spellEnd"/>
           </w:p>
         </w:tc>
         <w:tc>
@@ -160,7 +170,15 @@
           </w:tcPr>
           <w:p>
             <w:r>
-              <w:t>/orders/:id</w:t>
+              <w:t>/</w:t>
+            </w:r>
+            <w:proofErr w:type="spellStart"/>
+            <w:r>
+              <w:t>orders</w:t>
+            </w:r>
+            <w:proofErr w:type="spellEnd"/>
+            <w:r>
+              <w:t>/:id</w:t>
             </w:r>
           </w:p>
         </w:tc>
@@ -192,8 +210,13 @@
           </w:tcPr>
           <w:p>
             <w:r>
-              <w:t>/orders</w:t>
-            </w:r>
+              <w:t>/</w:t>
+            </w:r>
+            <w:proofErr w:type="spellStart"/>
+            <w:r>
+              <w:t>orders</w:t>
+            </w:r>
+            <w:proofErr w:type="spellEnd"/>
           </w:p>
         </w:tc>
         <w:tc>
@@ -224,8 +247,13 @@
           </w:tcPr>
           <w:p>
             <w:r>
-              <w:t>/products</w:t>
-            </w:r>
+              <w:t>/</w:t>
+            </w:r>
+            <w:proofErr w:type="spellStart"/>
+            <w:r>
+              <w:t>products</w:t>
+            </w:r>
+            <w:proofErr w:type="spellEnd"/>
           </w:p>
         </w:tc>
         <w:tc>
@@ -262,7 +290,15 @@
           </w:tcPr>
           <w:p>
             <w:r>
-              <w:t>/products/:id</w:t>
+              <w:t>/</w:t>
+            </w:r>
+            <w:proofErr w:type="spellStart"/>
+            <w:r>
+              <w:t>products</w:t>
+            </w:r>
+            <w:proofErr w:type="spellEnd"/>
+            <w:r>
+              <w:t>/:id</w:t>
             </w:r>
           </w:p>
         </w:tc>
@@ -300,8 +336,13 @@
           </w:tcPr>
           <w:p>
             <w:r>
-              <w:t>/products</w:t>
-            </w:r>
+              <w:t>/</w:t>
+            </w:r>
+            <w:proofErr w:type="spellStart"/>
+            <w:r>
+              <w:t>products</w:t>
+            </w:r>
+            <w:proofErr w:type="spellEnd"/>
           </w:p>
         </w:tc>
         <w:tc>
@@ -332,7 +373,15 @@
           </w:tcPr>
           <w:p>
             <w:r>
-              <w:t>/products/:id/stock</w:t>
+              <w:t>/</w:t>
+            </w:r>
+            <w:proofErr w:type="spellStart"/>
+            <w:r>
+              <w:t>products</w:t>
+            </w:r>
+            <w:proofErr w:type="spellEnd"/>
+            <w:r>
+              <w:t>/:id/stock</w:t>
             </w:r>
           </w:p>
         </w:tc>
@@ -364,7 +413,15 @@
           </w:tcPr>
           <w:p>
             <w:r>
-              <w:t>/products/:id</w:t>
+              <w:t>/</w:t>
+            </w:r>
+            <w:proofErr w:type="spellStart"/>
+            <w:r>
+              <w:t>products</w:t>
+            </w:r>
+            <w:proofErr w:type="spellEnd"/>
+            <w:r>
+              <w:t>/:id</w:t>
             </w:r>
           </w:p>
         </w:tc>
@@ -396,8 +453,13 @@
           </w:tcPr>
           <w:p>
             <w:r>
-              <w:t>/users</w:t>
-            </w:r>
+              <w:t>/</w:t>
+            </w:r>
+            <w:proofErr w:type="spellStart"/>
+            <w:r>
+              <w:t>users</w:t>
+            </w:r>
+            <w:proofErr w:type="spellEnd"/>
           </w:p>
         </w:tc>
         <w:tc>
@@ -428,7 +490,15 @@
           </w:tcPr>
           <w:p>
             <w:r>
-              <w:t>/users/:id</w:t>
+              <w:t>/</w:t>
+            </w:r>
+            <w:proofErr w:type="spellStart"/>
+            <w:r>
+              <w:t>users</w:t>
+            </w:r>
+            <w:proofErr w:type="spellEnd"/>
+            <w:r>
+              <w:t>/:id</w:t>
             </w:r>
           </w:p>
         </w:tc>
@@ -460,8 +530,13 @@
           </w:tcPr>
           <w:p>
             <w:r>
-              <w:t>/users</w:t>
-            </w:r>
+              <w:t>/</w:t>
+            </w:r>
+            <w:proofErr w:type="spellStart"/>
+            <w:r>
+              <w:t>users</w:t>
+            </w:r>
+            <w:proofErr w:type="spellEnd"/>
           </w:p>
         </w:tc>
         <w:tc>
@@ -492,7 +567,15 @@
           </w:tcPr>
           <w:p>
             <w:r>
-              <w:t>/users/:id</w:t>
+              <w:t>/</w:t>
+            </w:r>
+            <w:proofErr w:type="spellStart"/>
+            <w:r>
+              <w:t>users</w:t>
+            </w:r>
+            <w:proofErr w:type="spellEnd"/>
+            <w:r>
+              <w:t>/:id</w:t>
             </w:r>
           </w:p>
         </w:tc>
@@ -548,7 +631,15 @@
         </w:numPr>
       </w:pPr>
       <w:r>
-        <w:t>Appels dans order-service, leur ordre, résultat en cas d’échec de l’un des 2</w:t>
+        <w:t xml:space="preserve">Appels dans </w:t>
+      </w:r>
+      <w:proofErr w:type="spellStart"/>
+      <w:r>
+        <w:t>order</w:t>
+      </w:r>
+      <w:proofErr w:type="spellEnd"/>
+      <w:r>
+        <w:t>-service, leur ordre, résultat en cas d’échec de l’un des 2</w:t>
       </w:r>
     </w:p>
     <w:p>
@@ -560,15 +651,47 @@
         </w:numPr>
       </w:pPr>
       <w:r>
-        <w:t>Appels dans order-service</w:t>
+        <w:t xml:space="preserve">Appels dans </w:t>
+      </w:r>
+      <w:proofErr w:type="spellStart"/>
+      <w:r>
+        <w:t>order</w:t>
+      </w:r>
+      <w:proofErr w:type="spellEnd"/>
+      <w:r>
+        <w:t>-service</w:t>
       </w:r>
       <w:r>
         <w:br/>
-        <w:t>- product-service ( /products/:id )</w:t>
+        <w:t xml:space="preserve">- </w:t>
+      </w:r>
+      <w:proofErr w:type="spellStart"/>
+      <w:r>
+        <w:t>product</w:t>
+      </w:r>
+      <w:proofErr w:type="spellEnd"/>
+      <w:r>
+        <w:t>-service ( /</w:t>
+      </w:r>
+      <w:proofErr w:type="spellStart"/>
+      <w:r>
+        <w:t>products</w:t>
+      </w:r>
+      <w:proofErr w:type="spellEnd"/>
+      <w:r>
+        <w:t>/:id )</w:t>
       </w:r>
       <w:r>
         <w:br/>
-        <w:t>- user-service ( /users/:id )</w:t>
+        <w:t>- user-service ( /</w:t>
+      </w:r>
+      <w:proofErr w:type="spellStart"/>
+      <w:r>
+        <w:t>users</w:t>
+      </w:r>
+      <w:proofErr w:type="spellEnd"/>
+      <w:r>
+        <w:t>/:id )</w:t>
       </w:r>
     </w:p>
     <w:p>
@@ -656,7 +779,31 @@
       </w:r>
       <w:r>
         <w:lastRenderedPageBreak/>
-        <w:t>de données ( memUsers, memOrders, memProducts ) et qui permettent de tester les requêtes API.</w:t>
+        <w:t xml:space="preserve">de données ( </w:t>
+      </w:r>
+      <w:proofErr w:type="spellStart"/>
+      <w:r>
+        <w:t>memUsers</w:t>
+      </w:r>
+      <w:proofErr w:type="spellEnd"/>
+      <w:r>
+        <w:t xml:space="preserve">, </w:t>
+      </w:r>
+      <w:proofErr w:type="spellStart"/>
+      <w:r>
+        <w:t>memOrders</w:t>
+      </w:r>
+      <w:proofErr w:type="spellEnd"/>
+      <w:r>
+        <w:t xml:space="preserve">, </w:t>
+      </w:r>
+      <w:proofErr w:type="spellStart"/>
+      <w:r>
+        <w:t>memProducts</w:t>
+      </w:r>
+      <w:proofErr w:type="spellEnd"/>
+      <w:r>
+        <w:t xml:space="preserve"> ) et qui permettent de tester les requêtes API.</w:t>
       </w:r>
     </w:p>
     <w:p>
@@ -672,6 +819,391 @@
       </w:r>
       <w:r>
         <w:br/>
+      </w:r>
+    </w:p>
+    <w:p>
+      <w:r>
+        <w:t xml:space="preserve">Exercice 2 : </w:t>
+      </w:r>
+      <w:r>
+        <w:t>Docker Compose — démarrage et vérification</w:t>
+      </w:r>
+    </w:p>
+    <w:p>
+      <w:pPr>
+        <w:pStyle w:val="Paragraphedeliste"/>
+        <w:numPr>
+          <w:ilvl w:val="0"/>
+          <w:numId w:val="6"/>
+        </w:numPr>
+      </w:pPr>
+      <w:r>
+        <w:t>Démarrage de l’application</w:t>
+      </w:r>
+    </w:p>
+    <w:p>
+      <w:r>
+        <w:drawing>
+          <wp:inline distT="0" distB="0" distL="0" distR="0" wp14:anchorId="63579D9D" wp14:editId="1DA55DC9">
+            <wp:extent cx="5862109" cy="1211580"/>
+            <wp:effectExtent l="0" t="0" r="5715" b="7620"/>
+            <wp:docPr id="980888787" name="Image 1"/>
+            <wp:cNvGraphicFramePr>
+              <a:graphicFrameLocks xmlns:a="http://schemas.openxmlformats.org/drawingml/2006/main" noChangeAspect="1"/>
+            </wp:cNvGraphicFramePr>
+            <a:graphic xmlns:a="http://schemas.openxmlformats.org/drawingml/2006/main">
+              <a:graphicData uri="http://schemas.openxmlformats.org/drawingml/2006/picture">
+                <pic:pic xmlns:pic="http://schemas.openxmlformats.org/drawingml/2006/picture">
+                  <pic:nvPicPr>
+                    <pic:cNvPr id="980888787" name=""/>
+                    <pic:cNvPicPr/>
+                  </pic:nvPicPr>
+                  <pic:blipFill>
+                    <a:blip r:embed="rId5"/>
+                    <a:stretch>
+                      <a:fillRect/>
+                    </a:stretch>
+                  </pic:blipFill>
+                  <pic:spPr>
+                    <a:xfrm>
+                      <a:off x="0" y="0"/>
+                      <a:ext cx="5872855" cy="1213801"/>
+                    </a:xfrm>
+                    <a:prstGeom prst="rect">
+                      <a:avLst/>
+                    </a:prstGeom>
+                  </pic:spPr>
+                </pic:pic>
+              </a:graphicData>
+            </a:graphic>
+          </wp:inline>
+        </w:drawing>
+      </w:r>
+    </w:p>
+    <w:p>
+      <w:pPr>
+        <w:pStyle w:val="Paragraphedeliste"/>
+        <w:numPr>
+          <w:ilvl w:val="0"/>
+          <w:numId w:val="6"/>
+        </w:numPr>
+      </w:pPr>
+      <w:r>
+        <w:t xml:space="preserve">Création d’un utilisateur / produit / commande via </w:t>
+      </w:r>
+      <w:proofErr w:type="spellStart"/>
+      <w:r>
+        <w:t>curl</w:t>
+      </w:r>
+      <w:proofErr w:type="spellEnd"/>
+    </w:p>
+    <w:p>
+      <w:pPr>
+        <w:pStyle w:val="Paragraphedeliste"/>
+        <w:numPr>
+          <w:ilvl w:val="0"/>
+          <w:numId w:val="5"/>
+        </w:numPr>
+      </w:pPr>
+      <w:r>
+        <w:t xml:space="preserve">Création d’un utilisateur : </w:t>
+      </w:r>
+    </w:p>
+    <w:p>
+      <w:r>
+        <w:t>curl.exe -X POST http://localhost:3001/users -H "Content-Type: application/</w:t>
+      </w:r>
+      <w:proofErr w:type="spellStart"/>
+      <w:r>
+        <w:t>json</w:t>
+      </w:r>
+      <w:proofErr w:type="spellEnd"/>
+      <w:r>
+        <w:t>" -d "{\"id\": 1, \"</w:t>
+      </w:r>
+      <w:proofErr w:type="spellStart"/>
+      <w:r>
+        <w:t>name</w:t>
+      </w:r>
+      <w:proofErr w:type="spellEnd"/>
+      <w:r>
+        <w:t>\": \"Alice Dupont\", \"email\": \"alice@example.com\"}"</w:t>
+      </w:r>
+    </w:p>
+    <w:p>
+      <w:pPr>
+        <w:pStyle w:val="Paragraphedeliste"/>
+        <w:numPr>
+          <w:ilvl w:val="0"/>
+          <w:numId w:val="5"/>
+        </w:numPr>
+      </w:pPr>
+      <w:r>
+        <w:t xml:space="preserve">Création d’un produit : </w:t>
+      </w:r>
+    </w:p>
+    <w:p>
+      <w:r>
+        <w:t>curl.exe -X POST http://localhost:3002/products -H "Content-Type: application/</w:t>
+      </w:r>
+      <w:proofErr w:type="spellStart"/>
+      <w:r>
+        <w:t>json</w:t>
+      </w:r>
+      <w:proofErr w:type="spellEnd"/>
+      <w:r>
+        <w:t>" -d "{\"id\": 1, \"</w:t>
+      </w:r>
+      <w:proofErr w:type="spellStart"/>
+      <w:r>
+        <w:t>name</w:t>
+      </w:r>
+      <w:proofErr w:type="spellEnd"/>
+      <w:r>
+        <w:t>\": \"Laptop Pro\", \"description\": \"Ordinateur portable haute performance\", \"</w:t>
+      </w:r>
+      <w:proofErr w:type="spellStart"/>
+      <w:r>
+        <w:t>price</w:t>
+      </w:r>
+      <w:proofErr w:type="spellEnd"/>
+      <w:r>
+        <w:t>\": 1299.99, \"stock\": 50 }"</w:t>
+      </w:r>
+    </w:p>
+    <w:p>
+      <w:pPr>
+        <w:pStyle w:val="Paragraphedeliste"/>
+        <w:numPr>
+          <w:ilvl w:val="0"/>
+          <w:numId w:val="5"/>
+        </w:numPr>
+      </w:pPr>
+      <w:r>
+        <w:t xml:space="preserve">Création d’une commande : </w:t>
+      </w:r>
+    </w:p>
+    <w:p>
+      <w:pPr>
+        <w:rPr>
+          <w:lang w:val="en-GB"/>
+        </w:rPr>
+      </w:pPr>
+      <w:r>
+        <w:rPr>
+          <w:lang w:val="en-GB"/>
+        </w:rPr>
+        <w:t>curl.exe -X POST http://localhost:3003/orders -H "Content-Type: application/</w:t>
+      </w:r>
+      <w:proofErr w:type="spellStart"/>
+      <w:r>
+        <w:rPr>
+          <w:lang w:val="en-GB"/>
+        </w:rPr>
+        <w:t>json</w:t>
+      </w:r>
+      <w:proofErr w:type="spellEnd"/>
+      <w:r>
+        <w:rPr>
+          <w:lang w:val="en-GB"/>
+        </w:rPr>
+        <w:t>" -d "{\"id\": 1, \"</w:t>
+      </w:r>
+      <w:proofErr w:type="spellStart"/>
+      <w:r>
+        <w:rPr>
+          <w:lang w:val="en-GB"/>
+        </w:rPr>
+        <w:t>user_id</w:t>
+      </w:r>
+      <w:proofErr w:type="spellEnd"/>
+      <w:r>
+        <w:rPr>
+          <w:lang w:val="en-GB"/>
+        </w:rPr>
+        <w:t>\": 1, \"items\": [{ \"</w:t>
+      </w:r>
+      <w:proofErr w:type="spellStart"/>
+      <w:r>
+        <w:rPr>
+          <w:lang w:val="en-GB"/>
+        </w:rPr>
+        <w:t>product_id</w:t>
+      </w:r>
+      <w:proofErr w:type="spellEnd"/>
+      <w:r>
+        <w:rPr>
+          <w:lang w:val="en-GB"/>
+        </w:rPr>
+        <w:t>\": 1, \"quantity\": 1, \"</w:t>
+      </w:r>
+      <w:proofErr w:type="spellStart"/>
+      <w:r>
+        <w:rPr>
+          <w:lang w:val="en-GB"/>
+        </w:rPr>
+        <w:t>unit_price</w:t>
+      </w:r>
+      <w:proofErr w:type="spellEnd"/>
+      <w:r>
+        <w:rPr>
+          <w:lang w:val="en-GB"/>
+        </w:rPr>
+        <w:t>\": 1299.99 }], \"total\": 1299.99, \"status\": \"completed\"}"</w:t>
+      </w:r>
+    </w:p>
+    <w:p>
+      <w:pPr>
+        <w:pStyle w:val="Paragraphedeliste"/>
+        <w:numPr>
+          <w:ilvl w:val="0"/>
+          <w:numId w:val="6"/>
+        </w:numPr>
+      </w:pPr>
+      <w:r>
+        <w:t>Test de création de commande a</w:t>
+      </w:r>
+      <w:r>
+        <w:t xml:space="preserve">vec un </w:t>
+      </w:r>
+      <w:proofErr w:type="spellStart"/>
+      <w:r>
+        <w:t>user_id</w:t>
+      </w:r>
+      <w:proofErr w:type="spellEnd"/>
+      <w:r>
+        <w:t xml:space="preserve"> inexistant :</w:t>
+      </w:r>
+    </w:p>
+    <w:p>
+      <w:pPr>
+        <w:pStyle w:val="Paragraphedeliste"/>
+        <w:numPr>
+          <w:ilvl w:val="0"/>
+          <w:numId w:val="5"/>
+        </w:numPr>
+      </w:pPr>
+      <w:r>
+        <w:t>Code HTTP obtenu : 404</w:t>
+      </w:r>
+    </w:p>
+    <w:p>
+      <w:pPr>
+        <w:pStyle w:val="Paragraphedeliste"/>
+        <w:numPr>
+          <w:ilvl w:val="0"/>
+          <w:numId w:val="5"/>
+        </w:numPr>
+      </w:pPr>
+      <w:r>
+        <w:t xml:space="preserve">Raison : L’utilisateur n’est pas trouvé, </w:t>
+      </w:r>
+      <w:proofErr w:type="spellStart"/>
+      <w:r>
+        <w:t>axios</w:t>
+      </w:r>
+      <w:proofErr w:type="spellEnd"/>
+      <w:r>
+        <w:t xml:space="preserve"> lance une erreur 404</w:t>
+      </w:r>
+    </w:p>
+    <w:p>
+      <w:pPr>
+        <w:pStyle w:val="Paragraphedeliste"/>
+        <w:numPr>
+          <w:ilvl w:val="0"/>
+          <w:numId w:val="6"/>
+        </w:numPr>
+      </w:pPr>
+      <w:r>
+        <w:t>Test stop et relance du user-service</w:t>
+      </w:r>
+    </w:p>
+    <w:p>
+      <w:pPr>
+        <w:pStyle w:val="Paragraphedeliste"/>
+        <w:numPr>
+          <w:ilvl w:val="0"/>
+          <w:numId w:val="5"/>
+        </w:numPr>
+      </w:pPr>
+      <w:r>
+        <w:t>Arrêt du container</w:t>
+      </w:r>
+    </w:p>
+    <w:p>
+      <w:r>
+        <w:drawing>
+          <wp:inline distT="0" distB="0" distL="0" distR="0" wp14:anchorId="39F5F170" wp14:editId="1C89CE61">
+            <wp:extent cx="5760720" cy="1170305"/>
+            <wp:effectExtent l="0" t="0" r="0" b="0"/>
+            <wp:docPr id="1085653519" name="Image 1"/>
+            <wp:cNvGraphicFramePr>
+              <a:graphicFrameLocks xmlns:a="http://schemas.openxmlformats.org/drawingml/2006/main" noChangeAspect="1"/>
+            </wp:cNvGraphicFramePr>
+            <a:graphic xmlns:a="http://schemas.openxmlformats.org/drawingml/2006/main">
+              <a:graphicData uri="http://schemas.openxmlformats.org/drawingml/2006/picture">
+                <pic:pic xmlns:pic="http://schemas.openxmlformats.org/drawingml/2006/picture">
+                  <pic:nvPicPr>
+                    <pic:cNvPr id="1085653519" name=""/>
+                    <pic:cNvPicPr/>
+                  </pic:nvPicPr>
+                  <pic:blipFill>
+                    <a:blip r:embed="rId6"/>
+                    <a:stretch>
+                      <a:fillRect/>
+                    </a:stretch>
+                  </pic:blipFill>
+                  <pic:spPr>
+                    <a:xfrm>
+                      <a:off x="0" y="0"/>
+                      <a:ext cx="5760720" cy="1170305"/>
+                    </a:xfrm>
+                    <a:prstGeom prst="rect">
+                      <a:avLst/>
+                    </a:prstGeom>
+                  </pic:spPr>
+                </pic:pic>
+              </a:graphicData>
+            </a:graphic>
+          </wp:inline>
+        </w:drawing>
+      </w:r>
+    </w:p>
+    <w:p>
+      <w:pPr>
+        <w:pStyle w:val="Paragraphedeliste"/>
+        <w:numPr>
+          <w:ilvl w:val="0"/>
+          <w:numId w:val="5"/>
+        </w:numPr>
+      </w:pPr>
+      <w:r>
+        <w:lastRenderedPageBreak/>
+        <w:t>Résultat après test de création d’une commande : Erreur 500</w:t>
+      </w:r>
+    </w:p>
+    <w:p>
+      <w:pPr>
+        <w:pStyle w:val="Paragraphedeliste"/>
+        <w:numPr>
+          <w:ilvl w:val="0"/>
+          <w:numId w:val="5"/>
+        </w:numPr>
+      </w:pPr>
+      <w:r>
+        <w:t xml:space="preserve">restart: </w:t>
+      </w:r>
+      <w:proofErr w:type="spellStart"/>
+      <w:r>
+        <w:t>unless-stopped</w:t>
+      </w:r>
+      <w:proofErr w:type="spellEnd"/>
+      <w:r>
+        <w:t xml:space="preserve"> ne suffit pas car en fais</w:t>
+      </w:r>
+      <w:r>
+        <w:t>ant ça, docker recherche une image alors que user-service est un conteneur</w:t>
       </w:r>
     </w:p>
     <w:sectPr>
@@ -791,7 +1323,7 @@
         <w:rFonts w:ascii="Aptos" w:eastAsiaTheme="minorHAnsi" w:hAnsi="Aptos" w:cstheme="minorBidi" w:hint="default"/>
       </w:rPr>
     </w:lvl>
-    <w:lvl w:ilvl="1" w:tplc="040C0003" w:tentative="1">
+    <w:lvl w:ilvl="1" w:tplc="040C0003">
       <w:start w:val="1"/>
       <w:numFmt w:val="bullet"/>
       <w:lvlText w:val="o"/>
@@ -1002,6 +1534,95 @@
     </w:lvl>
   </w:abstractNum>
   <w:abstractNum w:abstractNumId="3" w15:restartNumberingAfterBreak="0">
+    <w:nsid w:val="2EB6373D"/>
+    <w:multiLevelType w:val="hybridMultilevel"/>
+    <w:tmpl w:val="11B837A8"/>
+    <w:lvl w:ilvl="0" w:tplc="040C000F">
+      <w:start w:val="1"/>
+      <w:numFmt w:val="decimal"/>
+      <w:lvlText w:val="%1."/>
+      <w:lvlJc w:val="left"/>
+      <w:pPr>
+        <w:ind w:left="720" w:hanging="360"/>
+      </w:pPr>
+      <w:rPr>
+        <w:rFonts w:hint="default"/>
+      </w:rPr>
+    </w:lvl>
+    <w:lvl w:ilvl="1" w:tplc="040C0019" w:tentative="1">
+      <w:start w:val="1"/>
+      <w:numFmt w:val="lowerLetter"/>
+      <w:lvlText w:val="%2."/>
+      <w:lvlJc w:val="left"/>
+      <w:pPr>
+        <w:ind w:left="1440" w:hanging="360"/>
+      </w:pPr>
+    </w:lvl>
+    <w:lvl w:ilvl="2" w:tplc="040C001B" w:tentative="1">
+      <w:start w:val="1"/>
+      <w:numFmt w:val="lowerRoman"/>
+      <w:lvlText w:val="%3."/>
+      <w:lvlJc w:val="right"/>
+      <w:pPr>
+        <w:ind w:left="2160" w:hanging="180"/>
+      </w:pPr>
+    </w:lvl>
+    <w:lvl w:ilvl="3" w:tplc="040C000F" w:tentative="1">
+      <w:start w:val="1"/>
+      <w:numFmt w:val="decimal"/>
+      <w:lvlText w:val="%4."/>
+      <w:lvlJc w:val="left"/>
+      <w:pPr>
+        <w:ind w:left="2880" w:hanging="360"/>
+      </w:pPr>
+    </w:lvl>
+    <w:lvl w:ilvl="4" w:tplc="040C0019" w:tentative="1">
+      <w:start w:val="1"/>
+      <w:numFmt w:val="lowerLetter"/>
+      <w:lvlText w:val="%5."/>
+      <w:lvlJc w:val="left"/>
+      <w:pPr>
+        <w:ind w:left="3600" w:hanging="360"/>
+      </w:pPr>
+    </w:lvl>
+    <w:lvl w:ilvl="5" w:tplc="040C001B" w:tentative="1">
+      <w:start w:val="1"/>
+      <w:numFmt w:val="lowerRoman"/>
+      <w:lvlText w:val="%6."/>
+      <w:lvlJc w:val="right"/>
+      <w:pPr>
+        <w:ind w:left="4320" w:hanging="180"/>
+      </w:pPr>
+    </w:lvl>
+    <w:lvl w:ilvl="6" w:tplc="040C000F" w:tentative="1">
+      <w:start w:val="1"/>
+      <w:numFmt w:val="decimal"/>
+      <w:lvlText w:val="%7."/>
+      <w:lvlJc w:val="left"/>
+      <w:pPr>
+        <w:ind w:left="5040" w:hanging="360"/>
+      </w:pPr>
+    </w:lvl>
+    <w:lvl w:ilvl="7" w:tplc="040C0019" w:tentative="1">
+      <w:start w:val="1"/>
+      <w:numFmt w:val="lowerLetter"/>
+      <w:lvlText w:val="%8."/>
+      <w:lvlJc w:val="left"/>
+      <w:pPr>
+        <w:ind w:left="5760" w:hanging="360"/>
+      </w:pPr>
+    </w:lvl>
+    <w:lvl w:ilvl="8" w:tplc="040C001B" w:tentative="1">
+      <w:start w:val="1"/>
+      <w:numFmt w:val="lowerRoman"/>
+      <w:lvlText w:val="%9."/>
+      <w:lvlJc w:val="right"/>
+      <w:pPr>
+        <w:ind w:left="6480" w:hanging="180"/>
+      </w:pPr>
+    </w:lvl>
+  </w:abstractNum>
+  <w:abstractNum w:abstractNumId="4" w15:restartNumberingAfterBreak="0">
     <w:nsid w:val="4D190337"/>
     <w:multiLevelType w:val="hybridMultilevel"/>
     <w:tmpl w:val="24425912"/>
@@ -1114,7 +1735,7 @@
       </w:rPr>
     </w:lvl>
   </w:abstractNum>
-  <w:abstractNum w:abstractNumId="4" w15:restartNumberingAfterBreak="0">
+  <w:abstractNum w:abstractNumId="5" w15:restartNumberingAfterBreak="0">
     <w:nsid w:val="6499081C"/>
     <w:multiLevelType w:val="hybridMultilevel"/>
     <w:tmpl w:val="4D308F00"/>
@@ -1207,16 +1828,19 @@
     <w:abstractNumId w:val="0"/>
   </w:num>
   <w:num w:numId="2" w16cid:durableId="1778868464">
-    <w:abstractNumId w:val="4"/>
+    <w:abstractNumId w:val="5"/>
   </w:num>
   <w:num w:numId="3" w16cid:durableId="1553076396">
     <w:abstractNumId w:val="2"/>
   </w:num>
   <w:num w:numId="4" w16cid:durableId="360935915">
-    <w:abstractNumId w:val="3"/>
+    <w:abstractNumId w:val="4"/>
   </w:num>
   <w:num w:numId="5" w16cid:durableId="479271051">
     <w:abstractNumId w:val="1"/>
+  </w:num>
+  <w:num w:numId="6" w16cid:durableId="457114717">
+    <w:abstractNumId w:val="3"/>
   </w:num>
 </w:numbering>
 </file>

</xml_diff>